<commit_message>
Final package: rebuild OOP conversion document
Co-Authored-By: Claude Opus 5.5 <noreply@anthropic.com>
Claude-Session: https://claude.ai/code/session_01ExEX4PKTAMmBwPk554nYUX
</commit_message>
<xml_diff>
--- a/YSDA_YSDAX_OOP_Conversion.docx
+++ b/YSDA_YSDAX_OOP_Conversion.docx
@@ -77,7 +77,7 @@
           <w:sz w:val="22"/>
           <w:szCs w:val="22"/>
         </w:rPr>
-        <w:t xml:space="preserve">Version 1.1 – draft, code not yet compiled or tested in SAP</w:t>
+        <w:t xml:space="preserve">Version 1.2 – draft, code not yet compiled or tested in SAP</w:t>
       </w:r>
     </w:p>
     <w:p>
@@ -48994,7 +48994,7 @@
         <w:rPr>
           <w:rFonts w:ascii="Calibri" w:cs="Calibri" w:eastAsia="Calibri" w:hAnsi="Calibri"/>
         </w:rPr>
-        <w:t xml:space="preserve"> must exist and be active (step 4 of the implementation guide).</w:t>
+        <w:t xml:space="preserve"> must exist and be active (step 3 of the implementation guide).</w:t>
       </w:r>
     </w:p>
     <w:p>

</xml_diff>